<commit_message>
release: claude_toolkit v1.33.2 - org-switch guard, --demote opt-in, Jev gate hardening
- claude-session: org record, cross-org pre-warning with cost, same-org alias hint, opt-in sanitized fork
- claude-providers sync: no demotion unless --demote
- jev-gate / jev_mcp / opencode plugin: placeholder llmctl key guard; hosted stays shadow
- hermetic jev tests, strict carrier heading test, new runtime/org-switch tests
- review: round 1 NO-GO (3 IMPORTANT, fixed), round 2 GO

Co-Authored-By: Claude Sonnet 5.5 <noreply@anthropic.com>
</commit_message>
<xml_diff>
--- a/docs/User_Manual.docx
+++ b/docs/User_Manual.docx
@@ -36,7 +36,7 @@
         </w:p>
       </w:sdtContent>
     </w:sdt>
-    <w:bookmarkStart w:id="44" w:name="claude-toolkit--user-manual"/>
+    <w:bookmarkStart w:id="45" w:name="claude-toolkit--user-manual"/>
     <w:p>
       <w:pPr>
         <w:pStyle w:val="Heading1"/>
@@ -240,7 +240,7 @@
       </w:tr>
     </w:tbl>
     <w:bookmarkEnd w:id="14"/>
-    <w:bookmarkStart w:id="23" w:name="Xfbf973e222c5619bd8984c3f0b8d7d242d6bc7b"/>
+    <w:bookmarkStart w:id="24" w:name="Xfbf973e222c5619bd8984c3f0b8d7d242d6bc7b"/>
     <w:p>
       <w:pPr>
         <w:pStyle w:val="Heading2"/>
@@ -409,14 +409,13 @@
         <w:t xml:space="preserve">)</w:t>
       </w:r>
     </w:p>
-    <w:bookmarkEnd w:id="23"/>
-    <w:bookmarkStart w:id="29" w:name="Xca78bbd7ff0005c2b2cf2c93c8bb1582a97cc12"/>
-    <w:p>
-      <w:pPr>
-        <w:pStyle w:val="Heading2"/>
-      </w:pPr>
-      <w:r>
-        <w:t xml:space="preserve">3. Local models through llmctl (and the validation gate)</w:t>
+    <w:bookmarkStart w:id="23" w:name="X37e873a6e26b35f12a202720d647e3fe4d5f2a0"/>
+    <w:p>
+      <w:pPr>
+        <w:pStyle w:val="Heading3"/>
+      </w:pPr>
+      <w:r>
+        <w:t xml:space="preserve">2.1 Demotion, and switching aliases across organizations</w:t>
       </w:r>
     </w:p>
     <w:p>
@@ -428,12 +427,221 @@
         </w:numPr>
       </w:pPr>
       <w:r>
+        <w:rPr>
+          <w:rStyle w:val="VerbatimChar"/>
+        </w:rPr>
+        <w:t xml:space="preserve">claude-providers sync</w:t>
+      </w:r>
+      <w:r>
+        <w:t xml:space="preserve"> </w:t>
+      </w:r>
+      <w:r>
+        <w:t xml:space="preserve">only REPORTS orphaned provider aliases; to demote them run</w:t>
+      </w:r>
+      <w:r>
+        <w:t xml:space="preserve"> </w:t>
+      </w:r>
+      <w:r>
+        <w:rPr>
+          <w:rStyle w:val="VerbatimChar"/>
+        </w:rPr>
+        <w:t xml:space="preserve">claude-providers sync --demote</w:t>
+      </w:r>
+      <w:r>
+        <w:t xml:space="preserve"> </w:t>
+      </w:r>
+      <w:r>
+        <w:t xml:space="preserve">(opt-in, v1.33.2).</w:t>
+      </w:r>
+    </w:p>
+    <w:p>
+      <w:pPr>
+        <w:pStyle w:val="Compact"/>
+        <w:numPr>
+          <w:ilvl w:val="0"/>
+          <w:numId w:val="1002"/>
+        </w:numPr>
+      </w:pPr>
+      <w:r>
+        <w:t xml:space="preserve">Each</w:t>
+      </w:r>
+      <w:r>
+        <w:t xml:space="preserve"> </w:t>
+      </w:r>
+      <w:r>
+        <w:rPr>
+          <w:rStyle w:val="VerbatimChar"/>
+        </w:rPr>
+        <w:t xml:space="preserve">claudeN</w:t>
+      </w:r>
+      <w:r>
+        <w:t xml:space="preserve"> </w:t>
+      </w:r>
+      <w:r>
+        <w:t xml:space="preserve">alias is a separate Anthropic organization.</w:t>
+      </w:r>
+      <w:r>
+        <w:t xml:space="preserve"> </w:t>
+      </w:r>
+      <w:r>
+        <w:rPr>
+          <w:rStyle w:val="VerbatimChar"/>
+        </w:rPr>
+        <w:t xml:space="preserve">claude-unify</w:t>
+      </w:r>
+      <w:r>
+        <w:t xml:space="preserve"> </w:t>
+      </w:r>
+      <w:r>
+        <w:t xml:space="preserve">shares</w:t>
+      </w:r>
+      <w:r>
+        <w:t xml:space="preserve"> </w:t>
+      </w:r>
+      <w:r>
+        <w:rPr>
+          <w:rStyle w:val="VerbatimChar"/>
+        </w:rPr>
+        <w:t xml:space="preserve">projects/</w:t>
+      </w:r>
+      <w:r>
+        <w:t xml:space="preserve"> </w:t>
+      </w:r>
+      <w:r>
+        <w:t xml:space="preserve">and</w:t>
+      </w:r>
+      <w:r>
+        <w:t xml:space="preserve"> </w:t>
+      </w:r>
+      <w:r>
+        <w:rPr>
+          <w:rStyle w:val="VerbatimChar"/>
+        </w:rPr>
+        <w:t xml:space="preserve">sessions/</w:t>
+      </w:r>
+      <w:r>
+        <w:t xml:space="preserve">, so resuming a session under</w:t>
+      </w:r>
+      <w:r>
+        <w:t xml:space="preserve"> </w:t>
+      </w:r>
+      <w:r>
+        <w:t xml:space="preserve">an alias of another organization makes Claude Code print "can't use thinking from another organization": thinking-block signatures are</w:t>
+      </w:r>
+      <w:r>
+        <w:t xml:space="preserve"> </w:t>
+      </w:r>
+      <w:r>
+        <w:t xml:space="preserve">organization-bound, so the CLI drops them and re-reads the whole session uncached (slower, more tokens). This cannot be avoided at API</w:t>
+      </w:r>
+      <w:r>
+        <w:t xml:space="preserve"> </w:t>
+      </w:r>
+      <w:r>
+        <w:t xml:space="preserve">level for the unmodified session. The toolkit warns before launch (with the context size and a same-org alias to use instead);</w:t>
+      </w:r>
+      <w:r>
+        <w:t xml:space="preserve"> </w:t>
+      </w:r>
+      <w:r>
+        <w:rPr>
+          <w:rStyle w:val="VerbatimChar"/>
+        </w:rPr>
+        <w:t xml:space="preserve">CMA_SESSION_SANITIZE_ON_ORG_CHANGE=1</w:t>
+      </w:r>
+      <w:r>
+        <w:t xml:space="preserve"> </w:t>
+      </w:r>
+      <w:r>
+        <w:t xml:space="preserve">resumes a sanitized copy without thinking blocks (original kept);</w:t>
+      </w:r>
+      <w:r>
+        <w:t xml:space="preserve"> </w:t>
+      </w:r>
+      <w:r>
+        <w:rPr>
+          <w:rStyle w:val="VerbatimChar"/>
+        </w:rPr>
+        <w:t xml:space="preserve">claude-session sanitize-fork &lt;config_dir&gt; [sid]</w:t>
+      </w:r>
+      <w:r>
+        <w:t xml:space="preserve"> </w:t>
+      </w:r>
+      <w:r>
+        <w:t xml:space="preserve">does it by hand.</w:t>
+      </w:r>
+      <w:r>
+        <w:t xml:space="preserve"> </w:t>
+      </w:r>
+      <w:r>
+        <w:t xml:space="preserve">Provider aliases are not Anthropic organizations and are not guarded.</w:t>
+      </w:r>
+    </w:p>
+    <w:p>
+      <w:pPr>
+        <w:pStyle w:val="Compact"/>
+        <w:numPr>
+          <w:ilvl w:val="0"/>
+          <w:numId w:val="1002"/>
+        </w:numPr>
+      </w:pPr>
+      <w:r>
+        <w:t xml:space="preserve">Opt-in Jev wiring of every supported agent home:</w:t>
+      </w:r>
+      <w:r>
+        <w:t xml:space="preserve"> </w:t>
+      </w:r>
+      <w:r>
+        <w:rPr>
+          <w:rStyle w:val="VerbatimChar"/>
+        </w:rPr>
+        <w:t xml:space="preserve">jev-setup.sh --base-homes</w:t>
+      </w:r>
+      <w:r>
+        <w:t xml:space="preserve"> </w:t>
+      </w:r>
+      <w:r>
+        <w:t xml:space="preserve">or</w:t>
+      </w:r>
+      <w:r>
+        <w:t xml:space="preserve"> </w:t>
+      </w:r>
+      <w:r>
+        <w:rPr>
+          <w:rStyle w:val="VerbatimChar"/>
+        </w:rPr>
+        <w:t xml:space="preserve">JEV_WIRE_AGENT_HOMES=1</w:t>
+      </w:r>
+      <w:r>
+        <w:t xml:space="preserve">; hosted decision endpoints stay SHADOW.</w:t>
+      </w:r>
+    </w:p>
+    <w:bookmarkEnd w:id="23"/>
+    <w:bookmarkEnd w:id="24"/>
+    <w:bookmarkStart w:id="30" w:name="Xca78bbd7ff0005c2b2cf2c93c8bb1582a97cc12"/>
+    <w:p>
+      <w:pPr>
+        <w:pStyle w:val="Heading2"/>
+      </w:pPr>
+      <w:r>
+        <w:t xml:space="preserve">3. Local models through llmctl (and the validation gate)</w:t>
+      </w:r>
+    </w:p>
+    <w:p>
+      <w:pPr>
+        <w:pStyle w:val="Compact"/>
+        <w:numPr>
+          <w:ilvl w:val="0"/>
+          <w:numId w:val="1003"/>
+        </w:numPr>
+      </w:pPr>
+      <w:r>
         <w:t xml:space="preserve">Quickstart:</w:t>
       </w:r>
       <w:r>
         <w:t xml:space="preserve"> </w:t>
       </w:r>
-      <w:hyperlink r:id="rId24">
+      <w:hyperlink r:id="rId25">
         <w:r>
           <w:rPr>
             <w:rStyle w:val="Hyperlink"/>
@@ -447,7 +655,7 @@
         <w:pStyle w:val="Compact"/>
         <w:numPr>
           <w:ilvl w:val="0"/>
-          <w:numId w:val="1002"/>
+          <w:numId w:val="1003"/>
         </w:numPr>
       </w:pPr>
       <w:r>
@@ -456,7 +664,7 @@
       <w:r>
         <w:t xml:space="preserve"> </w:t>
       </w:r>
-      <w:hyperlink r:id="rId25">
+      <w:hyperlink r:id="rId26">
         <w:r>
           <w:rPr>
             <w:rStyle w:val="Hyperlink"/>
@@ -503,7 +711,7 @@
         <w:pStyle w:val="Compact"/>
         <w:numPr>
           <w:ilvl w:val="0"/>
-          <w:numId w:val="1002"/>
+          <w:numId w:val="1003"/>
         </w:numPr>
       </w:pPr>
       <w:r>
@@ -512,7 +720,7 @@
       <w:r>
         <w:t xml:space="preserve"> </w:t>
       </w:r>
-      <w:hyperlink r:id="rId26">
+      <w:hyperlink r:id="rId27">
         <w:r>
           <w:rPr>
             <w:rStyle w:val="Hyperlink"/>
@@ -526,7 +734,7 @@
         <w:pStyle w:val="Compact"/>
         <w:numPr>
           <w:ilvl w:val="0"/>
-          <w:numId w:val="1002"/>
+          <w:numId w:val="1003"/>
         </w:numPr>
       </w:pPr>
       <w:r>
@@ -535,7 +743,7 @@
       <w:r>
         <w:t xml:space="preserve"> </w:t>
       </w:r>
-      <w:hyperlink r:id="rId27">
+      <w:hyperlink r:id="rId28">
         <w:r>
           <w:rPr>
             <w:rStyle w:val="Hyperlink"/>
@@ -549,7 +757,7 @@
       <w:r>
         <w:t xml:space="preserve"> </w:t>
       </w:r>
-      <w:hyperlink r:id="rId28">
+      <w:hyperlink r:id="rId29">
         <w:r>
           <w:rPr>
             <w:rStyle w:val="Hyperlink"/>
@@ -558,8 +766,8 @@
         </w:r>
       </w:hyperlink>
     </w:p>
-    <w:bookmarkEnd w:id="29"/>
-    <w:bookmarkStart w:id="35" w:name="Xc0d211da56265d1471b0ebc1b5d736ee248011d"/>
+    <w:bookmarkEnd w:id="30"/>
+    <w:bookmarkStart w:id="36" w:name="Xc0d211da56265d1471b0ebc1b5d736ee248011d"/>
     <w:p>
       <w:pPr>
         <w:pStyle w:val="Heading2"/>
@@ -573,7 +781,7 @@
         <w:pStyle w:val="Compact"/>
         <w:numPr>
           <w:ilvl w:val="0"/>
-          <w:numId w:val="1003"/>
+          <w:numId w:val="1004"/>
         </w:numPr>
       </w:pPr>
       <w:r>
@@ -582,7 +790,7 @@
       <w:r>
         <w:t xml:space="preserve"> </w:t>
       </w:r>
-      <w:hyperlink r:id="rId30">
+      <w:hyperlink r:id="rId31">
         <w:r>
           <w:rPr>
             <w:rStyle w:val="Hyperlink"/>
@@ -596,7 +804,7 @@
         <w:pStyle w:val="Compact"/>
         <w:numPr>
           <w:ilvl w:val="0"/>
-          <w:numId w:val="1003"/>
+          <w:numId w:val="1004"/>
         </w:numPr>
       </w:pPr>
       <w:r>
@@ -605,7 +813,7 @@
       <w:r>
         <w:t xml:space="preserve"> </w:t>
       </w:r>
-      <w:hyperlink r:id="rId31">
+      <w:hyperlink r:id="rId32">
         <w:r>
           <w:rPr>
             <w:rStyle w:val="Hyperlink"/>
@@ -631,7 +839,7 @@
         <w:pStyle w:val="Compact"/>
         <w:numPr>
           <w:ilvl w:val="0"/>
-          <w:numId w:val="1003"/>
+          <w:numId w:val="1004"/>
         </w:numPr>
       </w:pPr>
       <w:r>
@@ -640,7 +848,7 @@
       <w:r>
         <w:t xml:space="preserve"> </w:t>
       </w:r>
-      <w:hyperlink r:id="rId32">
+      <w:hyperlink r:id="rId33">
         <w:r>
           <w:rPr>
             <w:rStyle w:val="Hyperlink"/>
@@ -654,7 +862,7 @@
         <w:pStyle w:val="Compact"/>
         <w:numPr>
           <w:ilvl w:val="0"/>
-          <w:numId w:val="1003"/>
+          <w:numId w:val="1004"/>
         </w:numPr>
       </w:pPr>
       <w:r>
@@ -663,7 +871,7 @@
       <w:r>
         <w:t xml:space="preserve"> </w:t>
       </w:r>
-      <w:hyperlink r:id="rId33">
+      <w:hyperlink r:id="rId34">
         <w:r>
           <w:rPr>
             <w:rStyle w:val="Hyperlink"/>
@@ -677,7 +885,7 @@
       <w:r>
         <w:t xml:space="preserve"> </w:t>
       </w:r>
-      <w:hyperlink r:id="rId34">
+      <w:hyperlink r:id="rId35">
         <w:r>
           <w:rPr>
             <w:rStyle w:val="Hyperlink"/>
@@ -686,8 +894,8 @@
         </w:r>
       </w:hyperlink>
     </w:p>
-    <w:bookmarkEnd w:id="35"/>
-    <w:bookmarkStart w:id="40" w:name="Xc051c99402894d57de76dc0a7d2ad0696a05949"/>
+    <w:bookmarkEnd w:id="36"/>
+    <w:bookmarkStart w:id="41" w:name="Xc051c99402894d57de76dc0a7d2ad0696a05949"/>
     <w:p>
       <w:pPr>
         <w:pStyle w:val="Heading2"/>
@@ -701,10 +909,10 @@
         <w:pStyle w:val="Compact"/>
         <w:numPr>
           <w:ilvl w:val="0"/>
-          <w:numId w:val="1004"/>
+          <w:numId w:val="1005"/>
         </w:numPr>
       </w:pPr>
-      <w:hyperlink r:id="rId36">
+      <w:hyperlink r:id="rId37">
         <w:r>
           <w:rPr>
             <w:rStyle w:val="Hyperlink"/>
@@ -733,10 +941,10 @@
         <w:pStyle w:val="Compact"/>
         <w:numPr>
           <w:ilvl w:val="0"/>
-          <w:numId w:val="1004"/>
+          <w:numId w:val="1005"/>
         </w:numPr>
       </w:pPr>
-      <w:hyperlink r:id="rId37">
+      <w:hyperlink r:id="rId38">
         <w:r>
           <w:rPr>
             <w:rStyle w:val="Hyperlink"/>
@@ -756,10 +964,10 @@
         <w:pStyle w:val="Compact"/>
         <w:numPr>
           <w:ilvl w:val="0"/>
-          <w:numId w:val="1004"/>
+          <w:numId w:val="1005"/>
         </w:numPr>
       </w:pPr>
-      <w:hyperlink r:id="rId38">
+      <w:hyperlink r:id="rId39">
         <w:r>
           <w:rPr>
             <w:rStyle w:val="Hyperlink"/>
@@ -779,10 +987,10 @@
         <w:pStyle w:val="Compact"/>
         <w:numPr>
           <w:ilvl w:val="0"/>
-          <w:numId w:val="1004"/>
+          <w:numId w:val="1005"/>
         </w:numPr>
       </w:pPr>
-      <w:hyperlink r:id="rId39">
+      <w:hyperlink r:id="rId40">
         <w:r>
           <w:rPr>
             <w:rStyle w:val="Hyperlink"/>
@@ -791,8 +999,8 @@
         </w:r>
       </w:hyperlink>
     </w:p>
-    <w:bookmarkEnd w:id="40"/>
-    <w:bookmarkStart w:id="42" w:name="Xaa45b83d0f919d13a9f0ce614ebd7d36e92dc4b"/>
+    <w:bookmarkEnd w:id="41"/>
+    <w:bookmarkStart w:id="43" w:name="Xaa45b83d0f919d13a9f0ce614ebd7d36e92dc4b"/>
     <w:p>
       <w:pPr>
         <w:pStyle w:val="Heading2"/>
@@ -806,10 +1014,10 @@
         <w:pStyle w:val="Compact"/>
         <w:numPr>
           <w:ilvl w:val="0"/>
-          <w:numId w:val="1005"/>
+          <w:numId w:val="1006"/>
         </w:numPr>
       </w:pPr>
-      <w:hyperlink r:id="rId41">
+      <w:hyperlink r:id="rId42">
         <w:r>
           <w:rPr>
             <w:rStyle w:val="Hyperlink"/>
@@ -829,7 +1037,7 @@
         <w:pStyle w:val="Compact"/>
         <w:numPr>
           <w:ilvl w:val="0"/>
-          <w:numId w:val="1005"/>
+          <w:numId w:val="1006"/>
         </w:numPr>
       </w:pPr>
       <w:hyperlink r:id="rId19">
@@ -847,8 +1055,8 @@
         <w:t xml:space="preserve">— Mermaid sources and rendered SVGs</w:t>
       </w:r>
     </w:p>
-    <w:bookmarkEnd w:id="42"/>
-    <w:bookmarkStart w:id="43" w:name="X345f761c5a96b06c67deaaf8279c125a462ab91"/>
+    <w:bookmarkEnd w:id="43"/>
+    <w:bookmarkStart w:id="44" w:name="X345f761c5a96b06c67deaaf8279c125a462ab91"/>
     <w:p>
       <w:pPr>
         <w:pStyle w:val="Heading2"/>
@@ -895,8 +1103,8 @@
         <w:t xml:space="preserve">suite of its own.</w:t>
       </w:r>
     </w:p>
-    <w:bookmarkEnd w:id="43"/>
     <w:bookmarkEnd w:id="44"/>
+    <w:bookmarkEnd w:id="45"/>
     <w:sectPr>
       <w:footnotePr>
         <w:numRestart w:val="eachSect"/>
@@ -1126,6 +1334,9 @@
     <w:abstractNumId w:val="991"/>
   </w:num>
   <w:num w:numId="1005">
+    <w:abstractNumId w:val="991"/>
+  </w:num>
+  <w:num w:numId="1006">
     <w:abstractNumId w:val="991"/>
   </w:num>
 </w:numbering>

</xml_diff>